<commit_message>
plasticiy with hebb weight scaling implemented. ready to run experiments
</commit_message>
<xml_diff>
--- a/data/plasticity_test/analysis/Report_Static_vs_Plasticity.docx
+++ b/data/plasticity_test/analysis/Report_Static_vs_Plasticity.docx
@@ -27,7 +27,7 @@
         <w:pStyle w:val="ListBullet"/>
       </w:pPr>
       <w:r>
-        <w:t>Static: C:\work_hard\byte\data\plasticity_test\rawdata\2026-03-03_16-19-45_static</w:t>
+        <w:t>Static w=0.1: C:\work_hard\byte\data\plasticity_test\rawdata\2026-03-04_12-26-54_static_w_0_1</w:t>
       </w:r>
     </w:p>
     <w:p>
@@ -35,7 +35,39 @@
         <w:pStyle w:val="ListBullet"/>
       </w:pPr>
       <w:r>
-        <w:t>Plasticity: C:\work_hard\byte\data\plasticity_test\rawdata\2026-03-03_16-47-57_plastcity_start_0_1_eta_0_1</w:t>
+        <w:t>Static w=0.6: C:\work_hard\byte\data\plasticity_test\rawdata\2026-03-04_12-05-02_no_plasticity</w:t>
+      </w:r>
+    </w:p>
+    <w:p>
+      <w:pPr>
+        <w:pStyle w:val="ListBullet"/>
+      </w:pPr>
+      <w:r>
+        <w:t>Static w=1.0: C:\work_hard\byte\data\plasticity_test\rawdata\2026-03-04_12-23-50_static_w_1</w:t>
+      </w:r>
+    </w:p>
+    <w:p>
+      <w:pPr>
+        <w:pStyle w:val="ListBullet"/>
+      </w:pPr>
+      <w:r>
+        <w:t>Plasticity, eta=0.05, w_0=0.1, mod=1.0: C:\work_hard\byte\data\plasticity_test\rawdata\2026-03-04_12-09-54_plasticity_eta_0_05_start_0_1</w:t>
+      </w:r>
+    </w:p>
+    <w:p>
+      <w:pPr>
+        <w:pStyle w:val="ListBullet"/>
+      </w:pPr>
+      <w:r>
+        <w:t>Plasticity, eta=0.025, w_0=0.1, mod=1.0: C:\work_hard\byte\data\plasticity_test\rawdata\2026-03-04_12-25-27_plasticity_eta_0_025_start_0_1</w:t>
+      </w:r>
+    </w:p>
+    <w:p>
+      <w:pPr>
+        <w:pStyle w:val="ListBullet"/>
+      </w:pPr>
+      <w:r>
+        <w:t>Plasticity, eta=0.025, w_0=0.1, mod=0.1: C:\work_hard\byte\data\plasticity_test\rawdata\2026-03-04_12-32-41_plasticity_eta_0_025_w_0_1_mod_0_1</w:t>
       </w:r>
     </w:p>
     <w:p>
@@ -51,7 +83,7 @@
         <w:pStyle w:val="Heading3"/>
       </w:pPr>
       <w:r>
-        <w:t>Static vs Plasticity</w:t>
+        <w:t>Static w=0.1 vs Static w=0.6</w:t>
       </w:r>
     </w:p>
     <w:tbl>
@@ -103,7 +135,7 @@
           </w:tcPr>
           <w:p>
             <w:r>
-              <w:t>0.0300</w:t>
+              <w:t>0.2900</w:t>
             </w:r>
           </w:p>
         </w:tc>
@@ -125,7 +157,1197 @@
           </w:tcPr>
           <w:p>
             <w:r>
-              <w:t>9.9999e-01</w:t>
+              <w:t>8.1141e-08</w:t>
+            </w:r>
+          </w:p>
+        </w:tc>
+      </w:tr>
+    </w:tbl>
+    <w:p>
+      <w:pPr>
+        <w:pStyle w:val="Heading3"/>
+      </w:pPr>
+      <w:r>
+        <w:t>Static w=0.1 vs Static w=1.0</w:t>
+      </w:r>
+    </w:p>
+    <w:tbl>
+      <w:tblPr>
+        <w:tblStyle w:val="LightGrid-Accent1"/>
+        <w:tblW w:type="auto" w:w="0"/>
+        <w:tblLook w:firstColumn="1" w:firstRow="1" w:lastColumn="0" w:lastRow="0" w:noHBand="0" w:noVBand="1" w:val="04A0"/>
+      </w:tblPr>
+      <w:tblGrid>
+        <w:gridCol w:w="4320"/>
+        <w:gridCol w:w="4320"/>
+      </w:tblGrid>
+      <w:tr>
+        <w:tc>
+          <w:tcPr>
+            <w:tcW w:type="dxa" w:w="4320"/>
+          </w:tcPr>
+          <w:p>
+            <w:r>
+              <w:t>Metric</w:t>
+            </w:r>
+          </w:p>
+        </w:tc>
+        <w:tc>
+          <w:tcPr>
+            <w:tcW w:type="dxa" w:w="4320"/>
+          </w:tcPr>
+          <w:p>
+            <w:r>
+              <w:t>Value</w:t>
+            </w:r>
+          </w:p>
+        </w:tc>
+      </w:tr>
+      <w:tr>
+        <w:tc>
+          <w:tcPr>
+            <w:tcW w:type="dxa" w:w="4320"/>
+          </w:tcPr>
+          <w:p>
+            <w:r>
+              <w:t>KS statistic</w:t>
+            </w:r>
+          </w:p>
+        </w:tc>
+        <w:tc>
+          <w:tcPr>
+            <w:tcW w:type="dxa" w:w="4320"/>
+          </w:tcPr>
+          <w:p>
+            <w:r>
+              <w:t>0.2650</w:t>
+            </w:r>
+          </w:p>
+        </w:tc>
+      </w:tr>
+      <w:tr>
+        <w:tc>
+          <w:tcPr>
+            <w:tcW w:type="dxa" w:w="4320"/>
+          </w:tcPr>
+          <w:p>
+            <w:r>
+              <w:t>p-value</w:t>
+            </w:r>
+          </w:p>
+        </w:tc>
+        <w:tc>
+          <w:tcPr>
+            <w:tcW w:type="dxa" w:w="4320"/>
+          </w:tcPr>
+          <w:p>
+            <w:r>
+              <w:t>1.3921e-06</w:t>
+            </w:r>
+          </w:p>
+        </w:tc>
+      </w:tr>
+    </w:tbl>
+    <w:p>
+      <w:pPr>
+        <w:pStyle w:val="Heading3"/>
+      </w:pPr>
+      <w:r>
+        <w:t>Static w=0.1 vs Plasticity, eta=0.05, w_0=0.1, mod=1.0</w:t>
+      </w:r>
+    </w:p>
+    <w:tbl>
+      <w:tblPr>
+        <w:tblStyle w:val="LightGrid-Accent1"/>
+        <w:tblW w:type="auto" w:w="0"/>
+        <w:tblLook w:firstColumn="1" w:firstRow="1" w:lastColumn="0" w:lastRow="0" w:noHBand="0" w:noVBand="1" w:val="04A0"/>
+      </w:tblPr>
+      <w:tblGrid>
+        <w:gridCol w:w="4320"/>
+        <w:gridCol w:w="4320"/>
+      </w:tblGrid>
+      <w:tr>
+        <w:tc>
+          <w:tcPr>
+            <w:tcW w:type="dxa" w:w="4320"/>
+          </w:tcPr>
+          <w:p>
+            <w:r>
+              <w:t>Metric</w:t>
+            </w:r>
+          </w:p>
+        </w:tc>
+        <w:tc>
+          <w:tcPr>
+            <w:tcW w:type="dxa" w:w="4320"/>
+          </w:tcPr>
+          <w:p>
+            <w:r>
+              <w:t>Value</w:t>
+            </w:r>
+          </w:p>
+        </w:tc>
+      </w:tr>
+      <w:tr>
+        <w:tc>
+          <w:tcPr>
+            <w:tcW w:type="dxa" w:w="4320"/>
+          </w:tcPr>
+          <w:p>
+            <w:r>
+              <w:t>KS statistic</w:t>
+            </w:r>
+          </w:p>
+        </w:tc>
+        <w:tc>
+          <w:tcPr>
+            <w:tcW w:type="dxa" w:w="4320"/>
+          </w:tcPr>
+          <w:p>
+            <w:r>
+              <w:t>0.3000</w:t>
+            </w:r>
+          </w:p>
+        </w:tc>
+      </w:tr>
+      <w:tr>
+        <w:tc>
+          <w:tcPr>
+            <w:tcW w:type="dxa" w:w="4320"/>
+          </w:tcPr>
+          <w:p>
+            <w:r>
+              <w:t>p-value</w:t>
+            </w:r>
+          </w:p>
+        </w:tc>
+        <w:tc>
+          <w:tcPr>
+            <w:tcW w:type="dxa" w:w="4320"/>
+          </w:tcPr>
+          <w:p>
+            <w:r>
+              <w:t>2.4125e-08</w:t>
+            </w:r>
+          </w:p>
+        </w:tc>
+      </w:tr>
+    </w:tbl>
+    <w:p>
+      <w:pPr>
+        <w:pStyle w:val="Heading3"/>
+      </w:pPr>
+      <w:r>
+        <w:t>Static w=0.1 vs Plasticity, eta=0.025, w_0=0.1, mod=1.0</w:t>
+      </w:r>
+    </w:p>
+    <w:tbl>
+      <w:tblPr>
+        <w:tblStyle w:val="LightGrid-Accent1"/>
+        <w:tblW w:type="auto" w:w="0"/>
+        <w:tblLook w:firstColumn="1" w:firstRow="1" w:lastColumn="0" w:lastRow="0" w:noHBand="0" w:noVBand="1" w:val="04A0"/>
+      </w:tblPr>
+      <w:tblGrid>
+        <w:gridCol w:w="4320"/>
+        <w:gridCol w:w="4320"/>
+      </w:tblGrid>
+      <w:tr>
+        <w:tc>
+          <w:tcPr>
+            <w:tcW w:type="dxa" w:w="4320"/>
+          </w:tcPr>
+          <w:p>
+            <w:r>
+              <w:t>Metric</w:t>
+            </w:r>
+          </w:p>
+        </w:tc>
+        <w:tc>
+          <w:tcPr>
+            <w:tcW w:type="dxa" w:w="4320"/>
+          </w:tcPr>
+          <w:p>
+            <w:r>
+              <w:t>Value</w:t>
+            </w:r>
+          </w:p>
+        </w:tc>
+      </w:tr>
+      <w:tr>
+        <w:tc>
+          <w:tcPr>
+            <w:tcW w:type="dxa" w:w="4320"/>
+          </w:tcPr>
+          <w:p>
+            <w:r>
+              <w:t>KS statistic</w:t>
+            </w:r>
+          </w:p>
+        </w:tc>
+        <w:tc>
+          <w:tcPr>
+            <w:tcW w:type="dxa" w:w="4320"/>
+          </w:tcPr>
+          <w:p>
+            <w:r>
+              <w:t>0.2450</w:t>
+            </w:r>
+          </w:p>
+        </w:tc>
+      </w:tr>
+      <w:tr>
+        <w:tc>
+          <w:tcPr>
+            <w:tcW w:type="dxa" w:w="4320"/>
+          </w:tcPr>
+          <w:p>
+            <w:r>
+              <w:t>p-value</w:t>
+            </w:r>
+          </w:p>
+        </w:tc>
+        <w:tc>
+          <w:tcPr>
+            <w:tcW w:type="dxa" w:w="4320"/>
+          </w:tcPr>
+          <w:p>
+            <w:r>
+              <w:t>1.1150e-05</w:t>
+            </w:r>
+          </w:p>
+        </w:tc>
+      </w:tr>
+    </w:tbl>
+    <w:p>
+      <w:pPr>
+        <w:pStyle w:val="Heading3"/>
+      </w:pPr>
+      <w:r>
+        <w:t>Static w=0.1 vs Plasticity, eta=0.025, w_0=0.1, mod=0.1</w:t>
+      </w:r>
+    </w:p>
+    <w:tbl>
+      <w:tblPr>
+        <w:tblStyle w:val="LightGrid-Accent1"/>
+        <w:tblW w:type="auto" w:w="0"/>
+        <w:tblLook w:firstColumn="1" w:firstRow="1" w:lastColumn="0" w:lastRow="0" w:noHBand="0" w:noVBand="1" w:val="04A0"/>
+      </w:tblPr>
+      <w:tblGrid>
+        <w:gridCol w:w="4320"/>
+        <w:gridCol w:w="4320"/>
+      </w:tblGrid>
+      <w:tr>
+        <w:tc>
+          <w:tcPr>
+            <w:tcW w:type="dxa" w:w="4320"/>
+          </w:tcPr>
+          <w:p>
+            <w:r>
+              <w:t>Metric</w:t>
+            </w:r>
+          </w:p>
+        </w:tc>
+        <w:tc>
+          <w:tcPr>
+            <w:tcW w:type="dxa" w:w="4320"/>
+          </w:tcPr>
+          <w:p>
+            <w:r>
+              <w:t>Value</w:t>
+            </w:r>
+          </w:p>
+        </w:tc>
+      </w:tr>
+      <w:tr>
+        <w:tc>
+          <w:tcPr>
+            <w:tcW w:type="dxa" w:w="4320"/>
+          </w:tcPr>
+          <w:p>
+            <w:r>
+              <w:t>KS statistic</w:t>
+            </w:r>
+          </w:p>
+        </w:tc>
+        <w:tc>
+          <w:tcPr>
+            <w:tcW w:type="dxa" w:w="4320"/>
+          </w:tcPr>
+          <w:p>
+            <w:r>
+              <w:t>0.2650</w:t>
+            </w:r>
+          </w:p>
+        </w:tc>
+      </w:tr>
+      <w:tr>
+        <w:tc>
+          <w:tcPr>
+            <w:tcW w:type="dxa" w:w="4320"/>
+          </w:tcPr>
+          <w:p>
+            <w:r>
+              <w:t>p-value</w:t>
+            </w:r>
+          </w:p>
+        </w:tc>
+        <w:tc>
+          <w:tcPr>
+            <w:tcW w:type="dxa" w:w="4320"/>
+          </w:tcPr>
+          <w:p>
+            <w:r>
+              <w:t>1.3921e-06</w:t>
+            </w:r>
+          </w:p>
+        </w:tc>
+      </w:tr>
+    </w:tbl>
+    <w:p>
+      <w:pPr>
+        <w:pStyle w:val="Heading3"/>
+      </w:pPr>
+      <w:r>
+        <w:t>Static w=0.6 vs Static w=1.0</w:t>
+      </w:r>
+    </w:p>
+    <w:tbl>
+      <w:tblPr>
+        <w:tblStyle w:val="LightGrid-Accent1"/>
+        <w:tblW w:type="auto" w:w="0"/>
+        <w:tblLook w:firstColumn="1" w:firstRow="1" w:lastColumn="0" w:lastRow="0" w:noHBand="0" w:noVBand="1" w:val="04A0"/>
+      </w:tblPr>
+      <w:tblGrid>
+        <w:gridCol w:w="4320"/>
+        <w:gridCol w:w="4320"/>
+      </w:tblGrid>
+      <w:tr>
+        <w:tc>
+          <w:tcPr>
+            <w:tcW w:type="dxa" w:w="4320"/>
+          </w:tcPr>
+          <w:p>
+            <w:r>
+              <w:t>Metric</w:t>
+            </w:r>
+          </w:p>
+        </w:tc>
+        <w:tc>
+          <w:tcPr>
+            <w:tcW w:type="dxa" w:w="4320"/>
+          </w:tcPr>
+          <w:p>
+            <w:r>
+              <w:t>Value</w:t>
+            </w:r>
+          </w:p>
+        </w:tc>
+      </w:tr>
+      <w:tr>
+        <w:tc>
+          <w:tcPr>
+            <w:tcW w:type="dxa" w:w="4320"/>
+          </w:tcPr>
+          <w:p>
+            <w:r>
+              <w:t>KS statistic</w:t>
+            </w:r>
+          </w:p>
+        </w:tc>
+        <w:tc>
+          <w:tcPr>
+            <w:tcW w:type="dxa" w:w="4320"/>
+          </w:tcPr>
+          <w:p>
+            <w:r>
+              <w:t>0.0750</w:t>
+            </w:r>
+          </w:p>
+        </w:tc>
+      </w:tr>
+      <w:tr>
+        <w:tc>
+          <w:tcPr>
+            <w:tcW w:type="dxa" w:w="4320"/>
+          </w:tcPr>
+          <w:p>
+            <w:r>
+              <w:t>p-value</w:t>
+            </w:r>
+          </w:p>
+        </w:tc>
+        <w:tc>
+          <w:tcPr>
+            <w:tcW w:type="dxa" w:w="4320"/>
+          </w:tcPr>
+          <w:p>
+            <w:r>
+              <w:t>6.2843e-01</w:t>
+            </w:r>
+          </w:p>
+        </w:tc>
+      </w:tr>
+    </w:tbl>
+    <w:p>
+      <w:pPr>
+        <w:pStyle w:val="Heading3"/>
+      </w:pPr>
+      <w:r>
+        <w:t>Static w=0.6 vs Plasticity, eta=0.05, w_0=0.1, mod=1.0</w:t>
+      </w:r>
+    </w:p>
+    <w:tbl>
+      <w:tblPr>
+        <w:tblStyle w:val="LightGrid-Accent1"/>
+        <w:tblW w:type="auto" w:w="0"/>
+        <w:tblLook w:firstColumn="1" w:firstRow="1" w:lastColumn="0" w:lastRow="0" w:noHBand="0" w:noVBand="1" w:val="04A0"/>
+      </w:tblPr>
+      <w:tblGrid>
+        <w:gridCol w:w="4320"/>
+        <w:gridCol w:w="4320"/>
+      </w:tblGrid>
+      <w:tr>
+        <w:tc>
+          <w:tcPr>
+            <w:tcW w:type="dxa" w:w="4320"/>
+          </w:tcPr>
+          <w:p>
+            <w:r>
+              <w:t>Metric</w:t>
+            </w:r>
+          </w:p>
+        </w:tc>
+        <w:tc>
+          <w:tcPr>
+            <w:tcW w:type="dxa" w:w="4320"/>
+          </w:tcPr>
+          <w:p>
+            <w:r>
+              <w:t>Value</w:t>
+            </w:r>
+          </w:p>
+        </w:tc>
+      </w:tr>
+      <w:tr>
+        <w:tc>
+          <w:tcPr>
+            <w:tcW w:type="dxa" w:w="4320"/>
+          </w:tcPr>
+          <w:p>
+            <w:r>
+              <w:t>KS statistic</w:t>
+            </w:r>
+          </w:p>
+        </w:tc>
+        <w:tc>
+          <w:tcPr>
+            <w:tcW w:type="dxa" w:w="4320"/>
+          </w:tcPr>
+          <w:p>
+            <w:r>
+              <w:t>0.0700</w:t>
+            </w:r>
+          </w:p>
+        </w:tc>
+      </w:tr>
+      <w:tr>
+        <w:tc>
+          <w:tcPr>
+            <w:tcW w:type="dxa" w:w="4320"/>
+          </w:tcPr>
+          <w:p>
+            <w:r>
+              <w:t>p-value</w:t>
+            </w:r>
+          </w:p>
+        </w:tc>
+        <w:tc>
+          <w:tcPr>
+            <w:tcW w:type="dxa" w:w="4320"/>
+          </w:tcPr>
+          <w:p>
+            <w:r>
+              <w:t>7.1258e-01</w:t>
+            </w:r>
+          </w:p>
+        </w:tc>
+      </w:tr>
+    </w:tbl>
+    <w:p>
+      <w:pPr>
+        <w:pStyle w:val="Heading3"/>
+      </w:pPr>
+      <w:r>
+        <w:t>Static w=0.6 vs Plasticity, eta=0.025, w_0=0.1, mod=1.0</w:t>
+      </w:r>
+    </w:p>
+    <w:tbl>
+      <w:tblPr>
+        <w:tblStyle w:val="LightGrid-Accent1"/>
+        <w:tblW w:type="auto" w:w="0"/>
+        <w:tblLook w:firstColumn="1" w:firstRow="1" w:lastColumn="0" w:lastRow="0" w:noHBand="0" w:noVBand="1" w:val="04A0"/>
+      </w:tblPr>
+      <w:tblGrid>
+        <w:gridCol w:w="4320"/>
+        <w:gridCol w:w="4320"/>
+      </w:tblGrid>
+      <w:tr>
+        <w:tc>
+          <w:tcPr>
+            <w:tcW w:type="dxa" w:w="4320"/>
+          </w:tcPr>
+          <w:p>
+            <w:r>
+              <w:t>Metric</w:t>
+            </w:r>
+          </w:p>
+        </w:tc>
+        <w:tc>
+          <w:tcPr>
+            <w:tcW w:type="dxa" w:w="4320"/>
+          </w:tcPr>
+          <w:p>
+            <w:r>
+              <w:t>Value</w:t>
+            </w:r>
+          </w:p>
+        </w:tc>
+      </w:tr>
+      <w:tr>
+        <w:tc>
+          <w:tcPr>
+            <w:tcW w:type="dxa" w:w="4320"/>
+          </w:tcPr>
+          <w:p>
+            <w:r>
+              <w:t>KS statistic</w:t>
+            </w:r>
+          </w:p>
+        </w:tc>
+        <w:tc>
+          <w:tcPr>
+            <w:tcW w:type="dxa" w:w="4320"/>
+          </w:tcPr>
+          <w:p>
+            <w:r>
+              <w:t>0.0750</w:t>
+            </w:r>
+          </w:p>
+        </w:tc>
+      </w:tr>
+      <w:tr>
+        <w:tc>
+          <w:tcPr>
+            <w:tcW w:type="dxa" w:w="4320"/>
+          </w:tcPr>
+          <w:p>
+            <w:r>
+              <w:t>p-value</w:t>
+            </w:r>
+          </w:p>
+        </w:tc>
+        <w:tc>
+          <w:tcPr>
+            <w:tcW w:type="dxa" w:w="4320"/>
+          </w:tcPr>
+          <w:p>
+            <w:r>
+              <w:t>6.2843e-01</w:t>
+            </w:r>
+          </w:p>
+        </w:tc>
+      </w:tr>
+    </w:tbl>
+    <w:p>
+      <w:pPr>
+        <w:pStyle w:val="Heading3"/>
+      </w:pPr>
+      <w:r>
+        <w:t>Static w=0.6 vs Plasticity, eta=0.025, w_0=0.1, mod=0.1</w:t>
+      </w:r>
+    </w:p>
+    <w:tbl>
+      <w:tblPr>
+        <w:tblStyle w:val="LightGrid-Accent1"/>
+        <w:tblW w:type="auto" w:w="0"/>
+        <w:tblLook w:firstColumn="1" w:firstRow="1" w:lastColumn="0" w:lastRow="0" w:noHBand="0" w:noVBand="1" w:val="04A0"/>
+      </w:tblPr>
+      <w:tblGrid>
+        <w:gridCol w:w="4320"/>
+        <w:gridCol w:w="4320"/>
+      </w:tblGrid>
+      <w:tr>
+        <w:tc>
+          <w:tcPr>
+            <w:tcW w:type="dxa" w:w="4320"/>
+          </w:tcPr>
+          <w:p>
+            <w:r>
+              <w:t>Metric</w:t>
+            </w:r>
+          </w:p>
+        </w:tc>
+        <w:tc>
+          <w:tcPr>
+            <w:tcW w:type="dxa" w:w="4320"/>
+          </w:tcPr>
+          <w:p>
+            <w:r>
+              <w:t>Value</w:t>
+            </w:r>
+          </w:p>
+        </w:tc>
+      </w:tr>
+      <w:tr>
+        <w:tc>
+          <w:tcPr>
+            <w:tcW w:type="dxa" w:w="4320"/>
+          </w:tcPr>
+          <w:p>
+            <w:r>
+              <w:t>KS statistic</w:t>
+            </w:r>
+          </w:p>
+        </w:tc>
+        <w:tc>
+          <w:tcPr>
+            <w:tcW w:type="dxa" w:w="4320"/>
+          </w:tcPr>
+          <w:p>
+            <w:r>
+              <w:t>0.0850</w:t>
+            </w:r>
+          </w:p>
+        </w:tc>
+      </w:tr>
+      <w:tr>
+        <w:tc>
+          <w:tcPr>
+            <w:tcW w:type="dxa" w:w="4320"/>
+          </w:tcPr>
+          <w:p>
+            <w:r>
+              <w:t>p-value</w:t>
+            </w:r>
+          </w:p>
+        </w:tc>
+        <w:tc>
+          <w:tcPr>
+            <w:tcW w:type="dxa" w:w="4320"/>
+          </w:tcPr>
+          <w:p>
+            <w:r>
+              <w:t>4.6629e-01</w:t>
+            </w:r>
+          </w:p>
+        </w:tc>
+      </w:tr>
+    </w:tbl>
+    <w:p>
+      <w:pPr>
+        <w:pStyle w:val="Heading3"/>
+      </w:pPr>
+      <w:r>
+        <w:t>Static w=1.0 vs Plasticity, eta=0.05, w_0=0.1, mod=1.0</w:t>
+      </w:r>
+    </w:p>
+    <w:tbl>
+      <w:tblPr>
+        <w:tblStyle w:val="LightGrid-Accent1"/>
+        <w:tblW w:type="auto" w:w="0"/>
+        <w:tblLook w:firstColumn="1" w:firstRow="1" w:lastColumn="0" w:lastRow="0" w:noHBand="0" w:noVBand="1" w:val="04A0"/>
+      </w:tblPr>
+      <w:tblGrid>
+        <w:gridCol w:w="4320"/>
+        <w:gridCol w:w="4320"/>
+      </w:tblGrid>
+      <w:tr>
+        <w:tc>
+          <w:tcPr>
+            <w:tcW w:type="dxa" w:w="4320"/>
+          </w:tcPr>
+          <w:p>
+            <w:r>
+              <w:t>Metric</w:t>
+            </w:r>
+          </w:p>
+        </w:tc>
+        <w:tc>
+          <w:tcPr>
+            <w:tcW w:type="dxa" w:w="4320"/>
+          </w:tcPr>
+          <w:p>
+            <w:r>
+              <w:t>Value</w:t>
+            </w:r>
+          </w:p>
+        </w:tc>
+      </w:tr>
+      <w:tr>
+        <w:tc>
+          <w:tcPr>
+            <w:tcW w:type="dxa" w:w="4320"/>
+          </w:tcPr>
+          <w:p>
+            <w:r>
+              <w:t>KS statistic</w:t>
+            </w:r>
+          </w:p>
+        </w:tc>
+        <w:tc>
+          <w:tcPr>
+            <w:tcW w:type="dxa" w:w="4320"/>
+          </w:tcPr>
+          <w:p>
+            <w:r>
+              <w:t>0.0850</w:t>
+            </w:r>
+          </w:p>
+        </w:tc>
+      </w:tr>
+      <w:tr>
+        <w:tc>
+          <w:tcPr>
+            <w:tcW w:type="dxa" w:w="4320"/>
+          </w:tcPr>
+          <w:p>
+            <w:r>
+              <w:t>p-value</w:t>
+            </w:r>
+          </w:p>
+        </w:tc>
+        <w:tc>
+          <w:tcPr>
+            <w:tcW w:type="dxa" w:w="4320"/>
+          </w:tcPr>
+          <w:p>
+            <w:r>
+              <w:t>4.6629e-01</w:t>
+            </w:r>
+          </w:p>
+        </w:tc>
+      </w:tr>
+    </w:tbl>
+    <w:p>
+      <w:pPr>
+        <w:pStyle w:val="Heading3"/>
+      </w:pPr>
+      <w:r>
+        <w:t>Static w=1.0 vs Plasticity, eta=0.025, w_0=0.1, mod=1.0</w:t>
+      </w:r>
+    </w:p>
+    <w:tbl>
+      <w:tblPr>
+        <w:tblStyle w:val="LightGrid-Accent1"/>
+        <w:tblW w:type="auto" w:w="0"/>
+        <w:tblLook w:firstColumn="1" w:firstRow="1" w:lastColumn="0" w:lastRow="0" w:noHBand="0" w:noVBand="1" w:val="04A0"/>
+      </w:tblPr>
+      <w:tblGrid>
+        <w:gridCol w:w="4320"/>
+        <w:gridCol w:w="4320"/>
+      </w:tblGrid>
+      <w:tr>
+        <w:tc>
+          <w:tcPr>
+            <w:tcW w:type="dxa" w:w="4320"/>
+          </w:tcPr>
+          <w:p>
+            <w:r>
+              <w:t>Metric</w:t>
+            </w:r>
+          </w:p>
+        </w:tc>
+        <w:tc>
+          <w:tcPr>
+            <w:tcW w:type="dxa" w:w="4320"/>
+          </w:tcPr>
+          <w:p>
+            <w:r>
+              <w:t>Value</w:t>
+            </w:r>
+          </w:p>
+        </w:tc>
+      </w:tr>
+      <w:tr>
+        <w:tc>
+          <w:tcPr>
+            <w:tcW w:type="dxa" w:w="4320"/>
+          </w:tcPr>
+          <w:p>
+            <w:r>
+              <w:t>KS statistic</w:t>
+            </w:r>
+          </w:p>
+        </w:tc>
+        <w:tc>
+          <w:tcPr>
+            <w:tcW w:type="dxa" w:w="4320"/>
+          </w:tcPr>
+          <w:p>
+            <w:r>
+              <w:t>0.0400</w:t>
+            </w:r>
+          </w:p>
+        </w:tc>
+      </w:tr>
+      <w:tr>
+        <w:tc>
+          <w:tcPr>
+            <w:tcW w:type="dxa" w:w="4320"/>
+          </w:tcPr>
+          <w:p>
+            <w:r>
+              <w:t>p-value</w:t>
+            </w:r>
+          </w:p>
+        </w:tc>
+        <w:tc>
+          <w:tcPr>
+            <w:tcW w:type="dxa" w:w="4320"/>
+          </w:tcPr>
+          <w:p>
+            <w:r>
+              <w:t>9.9733e-01</w:t>
+            </w:r>
+          </w:p>
+        </w:tc>
+      </w:tr>
+    </w:tbl>
+    <w:p>
+      <w:pPr>
+        <w:pStyle w:val="Heading3"/>
+      </w:pPr>
+      <w:r>
+        <w:t>Static w=1.0 vs Plasticity, eta=0.025, w_0=0.1, mod=0.1</w:t>
+      </w:r>
+    </w:p>
+    <w:tbl>
+      <w:tblPr>
+        <w:tblStyle w:val="LightGrid-Accent1"/>
+        <w:tblW w:type="auto" w:w="0"/>
+        <w:tblLook w:firstColumn="1" w:firstRow="1" w:lastColumn="0" w:lastRow="0" w:noHBand="0" w:noVBand="1" w:val="04A0"/>
+      </w:tblPr>
+      <w:tblGrid>
+        <w:gridCol w:w="4320"/>
+        <w:gridCol w:w="4320"/>
+      </w:tblGrid>
+      <w:tr>
+        <w:tc>
+          <w:tcPr>
+            <w:tcW w:type="dxa" w:w="4320"/>
+          </w:tcPr>
+          <w:p>
+            <w:r>
+              <w:t>Metric</w:t>
+            </w:r>
+          </w:p>
+        </w:tc>
+        <w:tc>
+          <w:tcPr>
+            <w:tcW w:type="dxa" w:w="4320"/>
+          </w:tcPr>
+          <w:p>
+            <w:r>
+              <w:t>Value</w:t>
+            </w:r>
+          </w:p>
+        </w:tc>
+      </w:tr>
+      <w:tr>
+        <w:tc>
+          <w:tcPr>
+            <w:tcW w:type="dxa" w:w="4320"/>
+          </w:tcPr>
+          <w:p>
+            <w:r>
+              <w:t>KS statistic</w:t>
+            </w:r>
+          </w:p>
+        </w:tc>
+        <w:tc>
+          <w:tcPr>
+            <w:tcW w:type="dxa" w:w="4320"/>
+          </w:tcPr>
+          <w:p>
+            <w:r>
+              <w:t>0.0700</w:t>
+            </w:r>
+          </w:p>
+        </w:tc>
+      </w:tr>
+      <w:tr>
+        <w:tc>
+          <w:tcPr>
+            <w:tcW w:type="dxa" w:w="4320"/>
+          </w:tcPr>
+          <w:p>
+            <w:r>
+              <w:t>p-value</w:t>
+            </w:r>
+          </w:p>
+        </w:tc>
+        <w:tc>
+          <w:tcPr>
+            <w:tcW w:type="dxa" w:w="4320"/>
+          </w:tcPr>
+          <w:p>
+            <w:r>
+              <w:t>7.1258e-01</w:t>
+            </w:r>
+          </w:p>
+        </w:tc>
+      </w:tr>
+    </w:tbl>
+    <w:p>
+      <w:pPr>
+        <w:pStyle w:val="Heading3"/>
+      </w:pPr>
+      <w:r>
+        <w:t>Plasticity, eta=0.05, w_0=0.1, mod=1.0 vs Plasticity, eta=0.025, w_0=0.1, mod=1.0</w:t>
+      </w:r>
+    </w:p>
+    <w:tbl>
+      <w:tblPr>
+        <w:tblStyle w:val="LightGrid-Accent1"/>
+        <w:tblW w:type="auto" w:w="0"/>
+        <w:tblLook w:firstColumn="1" w:firstRow="1" w:lastColumn="0" w:lastRow="0" w:noHBand="0" w:noVBand="1" w:val="04A0"/>
+      </w:tblPr>
+      <w:tblGrid>
+        <w:gridCol w:w="4320"/>
+        <w:gridCol w:w="4320"/>
+      </w:tblGrid>
+      <w:tr>
+        <w:tc>
+          <w:tcPr>
+            <w:tcW w:type="dxa" w:w="4320"/>
+          </w:tcPr>
+          <w:p>
+            <w:r>
+              <w:t>Metric</w:t>
+            </w:r>
+          </w:p>
+        </w:tc>
+        <w:tc>
+          <w:tcPr>
+            <w:tcW w:type="dxa" w:w="4320"/>
+          </w:tcPr>
+          <w:p>
+            <w:r>
+              <w:t>Value</w:t>
+            </w:r>
+          </w:p>
+        </w:tc>
+      </w:tr>
+      <w:tr>
+        <w:tc>
+          <w:tcPr>
+            <w:tcW w:type="dxa" w:w="4320"/>
+          </w:tcPr>
+          <w:p>
+            <w:r>
+              <w:t>KS statistic</w:t>
+            </w:r>
+          </w:p>
+        </w:tc>
+        <w:tc>
+          <w:tcPr>
+            <w:tcW w:type="dxa" w:w="4320"/>
+          </w:tcPr>
+          <w:p>
+            <w:r>
+              <w:t>0.0700</w:t>
+            </w:r>
+          </w:p>
+        </w:tc>
+      </w:tr>
+      <w:tr>
+        <w:tc>
+          <w:tcPr>
+            <w:tcW w:type="dxa" w:w="4320"/>
+          </w:tcPr>
+          <w:p>
+            <w:r>
+              <w:t>p-value</w:t>
+            </w:r>
+          </w:p>
+        </w:tc>
+        <w:tc>
+          <w:tcPr>
+            <w:tcW w:type="dxa" w:w="4320"/>
+          </w:tcPr>
+          <w:p>
+            <w:r>
+              <w:t>7.1258e-01</w:t>
+            </w:r>
+          </w:p>
+        </w:tc>
+      </w:tr>
+    </w:tbl>
+    <w:p>
+      <w:pPr>
+        <w:pStyle w:val="Heading3"/>
+      </w:pPr>
+      <w:r>
+        <w:t>Plasticity, eta=0.05, w_0=0.1, mod=1.0 vs Plasticity, eta=0.025, w_0=0.1, mod=0.1</w:t>
+      </w:r>
+    </w:p>
+    <w:tbl>
+      <w:tblPr>
+        <w:tblStyle w:val="LightGrid-Accent1"/>
+        <w:tblW w:type="auto" w:w="0"/>
+        <w:tblLook w:firstColumn="1" w:firstRow="1" w:lastColumn="0" w:lastRow="0" w:noHBand="0" w:noVBand="1" w:val="04A0"/>
+      </w:tblPr>
+      <w:tblGrid>
+        <w:gridCol w:w="4320"/>
+        <w:gridCol w:w="4320"/>
+      </w:tblGrid>
+      <w:tr>
+        <w:tc>
+          <w:tcPr>
+            <w:tcW w:type="dxa" w:w="4320"/>
+          </w:tcPr>
+          <w:p>
+            <w:r>
+              <w:t>Metric</w:t>
+            </w:r>
+          </w:p>
+        </w:tc>
+        <w:tc>
+          <w:tcPr>
+            <w:tcW w:type="dxa" w:w="4320"/>
+          </w:tcPr>
+          <w:p>
+            <w:r>
+              <w:t>Value</w:t>
+            </w:r>
+          </w:p>
+        </w:tc>
+      </w:tr>
+      <w:tr>
+        <w:tc>
+          <w:tcPr>
+            <w:tcW w:type="dxa" w:w="4320"/>
+          </w:tcPr>
+          <w:p>
+            <w:r>
+              <w:t>KS statistic</w:t>
+            </w:r>
+          </w:p>
+        </w:tc>
+        <w:tc>
+          <w:tcPr>
+            <w:tcW w:type="dxa" w:w="4320"/>
+          </w:tcPr>
+          <w:p>
+            <w:r>
+              <w:t>0.1000</w:t>
+            </w:r>
+          </w:p>
+        </w:tc>
+      </w:tr>
+      <w:tr>
+        <w:tc>
+          <w:tcPr>
+            <w:tcW w:type="dxa" w:w="4320"/>
+          </w:tcPr>
+          <w:p>
+            <w:r>
+              <w:t>p-value</w:t>
+            </w:r>
+          </w:p>
+        </w:tc>
+        <w:tc>
+          <w:tcPr>
+            <w:tcW w:type="dxa" w:w="4320"/>
+          </w:tcPr>
+          <w:p>
+            <w:r>
+              <w:t>2.7047e-01</w:t>
+            </w:r>
+          </w:p>
+        </w:tc>
+      </w:tr>
+    </w:tbl>
+    <w:p>
+      <w:pPr>
+        <w:pStyle w:val="Heading3"/>
+      </w:pPr>
+      <w:r>
+        <w:t>Plasticity, eta=0.025, w_0=0.1, mod=1.0 vs Plasticity, eta=0.025, w_0=0.1, mod=0.1</w:t>
+      </w:r>
+    </w:p>
+    <w:tbl>
+      <w:tblPr>
+        <w:tblStyle w:val="LightGrid-Accent1"/>
+        <w:tblW w:type="auto" w:w="0"/>
+        <w:tblLook w:firstColumn="1" w:firstRow="1" w:lastColumn="0" w:lastRow="0" w:noHBand="0" w:noVBand="1" w:val="04A0"/>
+      </w:tblPr>
+      <w:tblGrid>
+        <w:gridCol w:w="4320"/>
+        <w:gridCol w:w="4320"/>
+      </w:tblGrid>
+      <w:tr>
+        <w:tc>
+          <w:tcPr>
+            <w:tcW w:type="dxa" w:w="4320"/>
+          </w:tcPr>
+          <w:p>
+            <w:r>
+              <w:t>Metric</w:t>
+            </w:r>
+          </w:p>
+        </w:tc>
+        <w:tc>
+          <w:tcPr>
+            <w:tcW w:type="dxa" w:w="4320"/>
+          </w:tcPr>
+          <w:p>
+            <w:r>
+              <w:t>Value</w:t>
+            </w:r>
+          </w:p>
+        </w:tc>
+      </w:tr>
+      <w:tr>
+        <w:tc>
+          <w:tcPr>
+            <w:tcW w:type="dxa" w:w="4320"/>
+          </w:tcPr>
+          <w:p>
+            <w:r>
+              <w:t>KS statistic</w:t>
+            </w:r>
+          </w:p>
+        </w:tc>
+        <w:tc>
+          <w:tcPr>
+            <w:tcW w:type="dxa" w:w="4320"/>
+          </w:tcPr>
+          <w:p>
+            <w:r>
+              <w:t>0.0550</w:t>
+            </w:r>
+          </w:p>
+        </w:tc>
+      </w:tr>
+      <w:tr>
+        <w:tc>
+          <w:tcPr>
+            <w:tcW w:type="dxa" w:w="4320"/>
+          </w:tcPr>
+          <w:p>
+            <w:r>
+              <w:t>p-value</w:t>
+            </w:r>
+          </w:p>
+        </w:tc>
+        <w:tc>
+          <w:tcPr>
+            <w:tcW w:type="dxa" w:w="4320"/>
+          </w:tcPr>
+          <w:p>
+            <w:r>
+              <w:t>9.2384e-01</w:t>
             </w:r>
           </w:p>
         </w:tc>
@@ -414,6 +1636,51 @@
         <w:pStyle w:val="Heading3"/>
       </w:pPr>
       <w:r>
+        <w:t>Survival time distribution</w:t>
+      </w:r>
+    </w:p>
+    <w:p>
+      <w:r>
+        <w:drawing>
+          <wp:inline xmlns:a="http://schemas.openxmlformats.org/drawingml/2006/main" xmlns:pic="http://schemas.openxmlformats.org/drawingml/2006/picture">
+            <wp:extent cx="5486400" cy="2669483"/>
+            <wp:docPr id="7" name="Picture 7"/>
+            <wp:cNvGraphicFramePr>
+              <a:graphicFrameLocks noChangeAspect="1"/>
+            </wp:cNvGraphicFramePr>
+            <a:graphic>
+              <a:graphicData uri="http://schemas.openxmlformats.org/drawingml/2006/picture">
+                <pic:pic>
+                  <pic:nvPicPr>
+                    <pic:cNvPr id="0" name="05b_survival_histogram.png"/>
+                    <pic:cNvPicPr/>
+                  </pic:nvPicPr>
+                  <pic:blipFill>
+                    <a:blip r:embed="rId15"/>
+                    <a:stretch>
+                      <a:fillRect/>
+                    </a:stretch>
+                  </pic:blipFill>
+                  <pic:spPr>
+                    <a:xfrm>
+                      <a:off x="0" y="0"/>
+                      <a:ext cx="5486400" cy="2669483"/>
+                    </a:xfrm>
+                    <a:prstGeom prst="rect"/>
+                  </pic:spPr>
+                </pic:pic>
+              </a:graphicData>
+            </a:graphic>
+          </wp:inline>
+        </w:drawing>
+      </w:r>
+    </w:p>
+    <w:p/>
+    <w:p>
+      <w:pPr>
+        <w:pStyle w:val="Heading3"/>
+      </w:pPr>
+      <w:r>
         <w:t>Survival CCDF (log-log)</w:t>
       </w:r>
     </w:p>
@@ -422,7 +1689,7 @@
         <w:drawing>
           <wp:inline xmlns:a="http://schemas.openxmlformats.org/drawingml/2006/main" xmlns:pic="http://schemas.openxmlformats.org/drawingml/2006/picture">
             <wp:extent cx="5486400" cy="3329149"/>
-            <wp:docPr id="7" name="Picture 7"/>
+            <wp:docPr id="8" name="Picture 8"/>
             <wp:cNvGraphicFramePr>
               <a:graphicFrameLocks noChangeAspect="1"/>
             </wp:cNvGraphicFramePr>
@@ -434,7 +1701,7 @@
                     <pic:cNvPicPr/>
                   </pic:nvPicPr>
                   <pic:blipFill>
-                    <a:blip r:embed="rId15"/>
+                    <a:blip r:embed="rId16"/>
                     <a:stretch>
                       <a:fillRect/>
                     </a:stretch>

</xml_diff>

<commit_message>
parameter sweep for positive plasticity
</commit_message>
<xml_diff>
--- a/data/plasticity_test/analysis/Report_Static_vs_Plasticity.docx
+++ b/data/plasticity_test/analysis/Report_Static_vs_Plasticity.docx
@@ -27,7 +27,7 @@
         <w:pStyle w:val="ListBullet"/>
       </w:pPr>
       <w:r>
-        <w:t>Static w=0.1: C:\work_hard\byte\data\plasticity_test\rawdata\2026-03-04_13-21-15_static_w_0_1</w:t>
+        <w:t>Static w=0.1: D:\Jana\Projekte\byte\data\plasticity_test\rawdata\2026-03-04_13-21-15_static_w_0_1</w:t>
       </w:r>
     </w:p>
     <w:p>
@@ -35,7 +35,7 @@
         <w:pStyle w:val="ListBullet"/>
       </w:pPr>
       <w:r>
-        <w:t>Static w=1.0: C:\work_hard\byte\data\plasticity_test\rawdata\2026-03-04_13-19-06_static_w_1</w:t>
+        <w:t>Static w=1.0: D:\Jana\Projekte\byte\data\plasticity_test\rawdata\2026-03-04_13-19-06_static_w_1</w:t>
       </w:r>
     </w:p>
     <w:p>
@@ -43,7 +43,31 @@
         <w:pStyle w:val="ListBullet"/>
       </w:pPr>
       <w:r>
-        <w:t>Plastic w=0.1, eta=0.025, mod=0.1: C:\work_hard\byte\data\plasticity_test\rawdata\2026-03-04_13-24-36_plastic_w_0_1_eta_0_025_mod_0_1</w:t>
+        <w:t>Plastic w=0.1, eta=0.025, mod=0.1: D:\Jana\Projekte\byte\data\plasticity_test\rawdata\2026-03-04_13-24-36_plastic_w_0_1_eta_0_025_mod_0_1</w:t>
+      </w:r>
+    </w:p>
+    <w:p>
+      <w:pPr>
+        <w:pStyle w:val="ListBullet"/>
+      </w:pPr>
+      <w:r>
+        <w:t>Plastic w=0.1, eta=0.025, mod=0.05: D:\Jana\Projekte\byte\data\plasticity_test\rawdata\2026-03-05_15-29-04_plastic_w_0_1_eta_0_025_mod_0_05</w:t>
+      </w:r>
+    </w:p>
+    <w:p>
+      <w:pPr>
+        <w:pStyle w:val="ListBullet"/>
+      </w:pPr>
+      <w:r>
+        <w:t>Plastic w=0.1, eta=0.01, mod=0.1: D:\Jana\Projekte\byte\data\plasticity_test\rawdata\2026-03-05_15-20-01_plastic_w_0_1_eta_0_01_mod_0_1</w:t>
+      </w:r>
+    </w:p>
+    <w:p>
+      <w:pPr>
+        <w:pStyle w:val="ListBullet"/>
+      </w:pPr>
+      <w:r>
+        <w:t>Plastic w=0.1, eta=0.01, mod=0.05: D:\Jana\Projekte\byte\data\plasticity_test\rawdata\2026-03-05_15-41-21_plastic_w_0_1_eta_0_01_mod_0_05</w:t>
       </w:r>
     </w:p>
     <w:p>
@@ -229,6 +253,261 @@
         <w:pStyle w:val="Heading3"/>
       </w:pPr>
       <w:r>
+        <w:t>Static w=0.1 vs Plastic w=0.1, eta=0.025, mod=0.05</w:t>
+      </w:r>
+    </w:p>
+    <w:tbl>
+      <w:tblPr>
+        <w:tblStyle w:val="LightGrid-Accent1"/>
+        <w:tblW w:type="auto" w:w="0"/>
+        <w:tblLook w:firstColumn="1" w:firstRow="1" w:lastColumn="0" w:lastRow="0" w:noHBand="0" w:noVBand="1" w:val="04A0"/>
+      </w:tblPr>
+      <w:tblGrid>
+        <w:gridCol w:w="4320"/>
+        <w:gridCol w:w="4320"/>
+      </w:tblGrid>
+      <w:tr>
+        <w:tc>
+          <w:tcPr>
+            <w:tcW w:type="dxa" w:w="4320"/>
+          </w:tcPr>
+          <w:p>
+            <w:r>
+              <w:t>Metric</w:t>
+            </w:r>
+          </w:p>
+        </w:tc>
+        <w:tc>
+          <w:tcPr>
+            <w:tcW w:type="dxa" w:w="4320"/>
+          </w:tcPr>
+          <w:p>
+            <w:r>
+              <w:t>Value</w:t>
+            </w:r>
+          </w:p>
+        </w:tc>
+      </w:tr>
+      <w:tr>
+        <w:tc>
+          <w:tcPr>
+            <w:tcW w:type="dxa" w:w="4320"/>
+          </w:tcPr>
+          <w:p>
+            <w:r>
+              <w:t>KS statistic</w:t>
+            </w:r>
+          </w:p>
+        </w:tc>
+        <w:tc>
+          <w:tcPr>
+            <w:tcW w:type="dxa" w:w="4320"/>
+          </w:tcPr>
+          <w:p>
+            <w:r>
+              <w:t>0.1850</w:t>
+            </w:r>
+          </w:p>
+        </w:tc>
+      </w:tr>
+      <w:tr>
+        <w:tc>
+          <w:tcPr>
+            <w:tcW w:type="dxa" w:w="4320"/>
+          </w:tcPr>
+          <w:p>
+            <w:r>
+              <w:t>p-value</w:t>
+            </w:r>
+          </w:p>
+        </w:tc>
+        <w:tc>
+          <w:tcPr>
+            <w:tcW w:type="dxa" w:w="4320"/>
+          </w:tcPr>
+          <w:p>
+            <w:r>
+              <w:t>2.2850e-15</w:t>
+            </w:r>
+          </w:p>
+        </w:tc>
+      </w:tr>
+    </w:tbl>
+    <w:p>
+      <w:pPr>
+        <w:pStyle w:val="Heading3"/>
+      </w:pPr>
+      <w:r>
+        <w:t>Static w=0.1 vs Plastic w=0.1, eta=0.01, mod=0.1</w:t>
+      </w:r>
+    </w:p>
+    <w:tbl>
+      <w:tblPr>
+        <w:tblStyle w:val="LightGrid-Accent1"/>
+        <w:tblW w:type="auto" w:w="0"/>
+        <w:tblLook w:firstColumn="1" w:firstRow="1" w:lastColumn="0" w:lastRow="0" w:noHBand="0" w:noVBand="1" w:val="04A0"/>
+      </w:tblPr>
+      <w:tblGrid>
+        <w:gridCol w:w="4320"/>
+        <w:gridCol w:w="4320"/>
+      </w:tblGrid>
+      <w:tr>
+        <w:tc>
+          <w:tcPr>
+            <w:tcW w:type="dxa" w:w="4320"/>
+          </w:tcPr>
+          <w:p>
+            <w:r>
+              <w:t>Metric</w:t>
+            </w:r>
+          </w:p>
+        </w:tc>
+        <w:tc>
+          <w:tcPr>
+            <w:tcW w:type="dxa" w:w="4320"/>
+          </w:tcPr>
+          <w:p>
+            <w:r>
+              <w:t>Value</w:t>
+            </w:r>
+          </w:p>
+        </w:tc>
+      </w:tr>
+      <w:tr>
+        <w:tc>
+          <w:tcPr>
+            <w:tcW w:type="dxa" w:w="4320"/>
+          </w:tcPr>
+          <w:p>
+            <w:r>
+              <w:t>KS statistic</w:t>
+            </w:r>
+          </w:p>
+        </w:tc>
+        <w:tc>
+          <w:tcPr>
+            <w:tcW w:type="dxa" w:w="4320"/>
+          </w:tcPr>
+          <w:p>
+            <w:r>
+              <w:t>0.1460</w:t>
+            </w:r>
+          </w:p>
+        </w:tc>
+      </w:tr>
+      <w:tr>
+        <w:tc>
+          <w:tcPr>
+            <w:tcW w:type="dxa" w:w="4320"/>
+          </w:tcPr>
+          <w:p>
+            <w:r>
+              <w:t>p-value</w:t>
+            </w:r>
+          </w:p>
+        </w:tc>
+        <w:tc>
+          <w:tcPr>
+            <w:tcW w:type="dxa" w:w="4320"/>
+          </w:tcPr>
+          <w:p>
+            <w:r>
+              <w:t>1.0354e-09</w:t>
+            </w:r>
+          </w:p>
+        </w:tc>
+      </w:tr>
+    </w:tbl>
+    <w:p>
+      <w:pPr>
+        <w:pStyle w:val="Heading3"/>
+      </w:pPr>
+      <w:r>
+        <w:t>Static w=0.1 vs Plastic w=0.1, eta=0.01, mod=0.05</w:t>
+      </w:r>
+    </w:p>
+    <w:tbl>
+      <w:tblPr>
+        <w:tblStyle w:val="LightGrid-Accent1"/>
+        <w:tblW w:type="auto" w:w="0"/>
+        <w:tblLook w:firstColumn="1" w:firstRow="1" w:lastColumn="0" w:lastRow="0" w:noHBand="0" w:noVBand="1" w:val="04A0"/>
+      </w:tblPr>
+      <w:tblGrid>
+        <w:gridCol w:w="4320"/>
+        <w:gridCol w:w="4320"/>
+      </w:tblGrid>
+      <w:tr>
+        <w:tc>
+          <w:tcPr>
+            <w:tcW w:type="dxa" w:w="4320"/>
+          </w:tcPr>
+          <w:p>
+            <w:r>
+              <w:t>Metric</w:t>
+            </w:r>
+          </w:p>
+        </w:tc>
+        <w:tc>
+          <w:tcPr>
+            <w:tcW w:type="dxa" w:w="4320"/>
+          </w:tcPr>
+          <w:p>
+            <w:r>
+              <w:t>Value</w:t>
+            </w:r>
+          </w:p>
+        </w:tc>
+      </w:tr>
+      <w:tr>
+        <w:tc>
+          <w:tcPr>
+            <w:tcW w:type="dxa" w:w="4320"/>
+          </w:tcPr>
+          <w:p>
+            <w:r>
+              <w:t>KS statistic</w:t>
+            </w:r>
+          </w:p>
+        </w:tc>
+        <w:tc>
+          <w:tcPr>
+            <w:tcW w:type="dxa" w:w="4320"/>
+          </w:tcPr>
+          <w:p>
+            <w:r>
+              <w:t>0.1520</w:t>
+            </w:r>
+          </w:p>
+        </w:tc>
+      </w:tr>
+      <w:tr>
+        <w:tc>
+          <w:tcPr>
+            <w:tcW w:type="dxa" w:w="4320"/>
+          </w:tcPr>
+          <w:p>
+            <w:r>
+              <w:t>p-value</w:t>
+            </w:r>
+          </w:p>
+        </w:tc>
+        <w:tc>
+          <w:tcPr>
+            <w:tcW w:type="dxa" w:w="4320"/>
+          </w:tcPr>
+          <w:p>
+            <w:r>
+              <w:t>1.7107e-10</w:t>
+            </w:r>
+          </w:p>
+        </w:tc>
+      </w:tr>
+    </w:tbl>
+    <w:p>
+      <w:pPr>
+        <w:pStyle w:val="Heading3"/>
+      </w:pPr>
+      <w:r>
         <w:t>Static w=1.0 vs Plastic w=0.1, eta=0.025, mod=0.1</w:t>
       </w:r>
     </w:p>
@@ -304,6 +583,771 @@
           <w:p>
             <w:r>
               <w:t>6.9176e-02</w:t>
+            </w:r>
+          </w:p>
+        </w:tc>
+      </w:tr>
+    </w:tbl>
+    <w:p>
+      <w:pPr>
+        <w:pStyle w:val="Heading3"/>
+      </w:pPr>
+      <w:r>
+        <w:t>Static w=1.0 vs Plastic w=0.1, eta=0.025, mod=0.05</w:t>
+      </w:r>
+    </w:p>
+    <w:tbl>
+      <w:tblPr>
+        <w:tblStyle w:val="LightGrid-Accent1"/>
+        <w:tblW w:type="auto" w:w="0"/>
+        <w:tblLook w:firstColumn="1" w:firstRow="1" w:lastColumn="0" w:lastRow="0" w:noHBand="0" w:noVBand="1" w:val="04A0"/>
+      </w:tblPr>
+      <w:tblGrid>
+        <w:gridCol w:w="4320"/>
+        <w:gridCol w:w="4320"/>
+      </w:tblGrid>
+      <w:tr>
+        <w:tc>
+          <w:tcPr>
+            <w:tcW w:type="dxa" w:w="4320"/>
+          </w:tcPr>
+          <w:p>
+            <w:r>
+              <w:t>Metric</w:t>
+            </w:r>
+          </w:p>
+        </w:tc>
+        <w:tc>
+          <w:tcPr>
+            <w:tcW w:type="dxa" w:w="4320"/>
+          </w:tcPr>
+          <w:p>
+            <w:r>
+              <w:t>Value</w:t>
+            </w:r>
+          </w:p>
+        </w:tc>
+      </w:tr>
+      <w:tr>
+        <w:tc>
+          <w:tcPr>
+            <w:tcW w:type="dxa" w:w="4320"/>
+          </w:tcPr>
+          <w:p>
+            <w:r>
+              <w:t>KS statistic</w:t>
+            </w:r>
+          </w:p>
+        </w:tc>
+        <w:tc>
+          <w:tcPr>
+            <w:tcW w:type="dxa" w:w="4320"/>
+          </w:tcPr>
+          <w:p>
+            <w:r>
+              <w:t>0.1080</w:t>
+            </w:r>
+          </w:p>
+        </w:tc>
+      </w:tr>
+      <w:tr>
+        <w:tc>
+          <w:tcPr>
+            <w:tcW w:type="dxa" w:w="4320"/>
+          </w:tcPr>
+          <w:p>
+            <w:r>
+              <w:t>p-value</w:t>
+            </w:r>
+          </w:p>
+        </w:tc>
+        <w:tc>
+          <w:tcPr>
+            <w:tcW w:type="dxa" w:w="4320"/>
+          </w:tcPr>
+          <w:p>
+            <w:r>
+              <w:t>1.6907e-05</w:t>
+            </w:r>
+          </w:p>
+        </w:tc>
+      </w:tr>
+    </w:tbl>
+    <w:p>
+      <w:pPr>
+        <w:pStyle w:val="Heading3"/>
+      </w:pPr>
+      <w:r>
+        <w:t>Static w=1.0 vs Plastic w=0.1, eta=0.01, mod=0.1</w:t>
+      </w:r>
+    </w:p>
+    <w:tbl>
+      <w:tblPr>
+        <w:tblStyle w:val="LightGrid-Accent1"/>
+        <w:tblW w:type="auto" w:w="0"/>
+        <w:tblLook w:firstColumn="1" w:firstRow="1" w:lastColumn="0" w:lastRow="0" w:noHBand="0" w:noVBand="1" w:val="04A0"/>
+      </w:tblPr>
+      <w:tblGrid>
+        <w:gridCol w:w="4320"/>
+        <w:gridCol w:w="4320"/>
+      </w:tblGrid>
+      <w:tr>
+        <w:tc>
+          <w:tcPr>
+            <w:tcW w:type="dxa" w:w="4320"/>
+          </w:tcPr>
+          <w:p>
+            <w:r>
+              <w:t>Metric</w:t>
+            </w:r>
+          </w:p>
+        </w:tc>
+        <w:tc>
+          <w:tcPr>
+            <w:tcW w:type="dxa" w:w="4320"/>
+          </w:tcPr>
+          <w:p>
+            <w:r>
+              <w:t>Value</w:t>
+            </w:r>
+          </w:p>
+        </w:tc>
+      </w:tr>
+      <w:tr>
+        <w:tc>
+          <w:tcPr>
+            <w:tcW w:type="dxa" w:w="4320"/>
+          </w:tcPr>
+          <w:p>
+            <w:r>
+              <w:t>KS statistic</w:t>
+            </w:r>
+          </w:p>
+        </w:tc>
+        <w:tc>
+          <w:tcPr>
+            <w:tcW w:type="dxa" w:w="4320"/>
+          </w:tcPr>
+          <w:p>
+            <w:r>
+              <w:t>0.1370</w:t>
+            </w:r>
+          </w:p>
+        </w:tc>
+      </w:tr>
+      <w:tr>
+        <w:tc>
+          <w:tcPr>
+            <w:tcW w:type="dxa" w:w="4320"/>
+          </w:tcPr>
+          <w:p>
+            <w:r>
+              <w:t>p-value</w:t>
+            </w:r>
+          </w:p>
+        </w:tc>
+        <w:tc>
+          <w:tcPr>
+            <w:tcW w:type="dxa" w:w="4320"/>
+          </w:tcPr>
+          <w:p>
+            <w:r>
+              <w:t>1.3433e-08</w:t>
+            </w:r>
+          </w:p>
+        </w:tc>
+      </w:tr>
+    </w:tbl>
+    <w:p>
+      <w:pPr>
+        <w:pStyle w:val="Heading3"/>
+      </w:pPr>
+      <w:r>
+        <w:t>Static w=1.0 vs Plastic w=0.1, eta=0.01, mod=0.05</w:t>
+      </w:r>
+    </w:p>
+    <w:tbl>
+      <w:tblPr>
+        <w:tblStyle w:val="LightGrid-Accent1"/>
+        <w:tblW w:type="auto" w:w="0"/>
+        <w:tblLook w:firstColumn="1" w:firstRow="1" w:lastColumn="0" w:lastRow="0" w:noHBand="0" w:noVBand="1" w:val="04A0"/>
+      </w:tblPr>
+      <w:tblGrid>
+        <w:gridCol w:w="4320"/>
+        <w:gridCol w:w="4320"/>
+      </w:tblGrid>
+      <w:tr>
+        <w:tc>
+          <w:tcPr>
+            <w:tcW w:type="dxa" w:w="4320"/>
+          </w:tcPr>
+          <w:p>
+            <w:r>
+              <w:t>Metric</w:t>
+            </w:r>
+          </w:p>
+        </w:tc>
+        <w:tc>
+          <w:tcPr>
+            <w:tcW w:type="dxa" w:w="4320"/>
+          </w:tcPr>
+          <w:p>
+            <w:r>
+              <w:t>Value</w:t>
+            </w:r>
+          </w:p>
+        </w:tc>
+      </w:tr>
+      <w:tr>
+        <w:tc>
+          <w:tcPr>
+            <w:tcW w:type="dxa" w:w="4320"/>
+          </w:tcPr>
+          <w:p>
+            <w:r>
+              <w:t>KS statistic</w:t>
+            </w:r>
+          </w:p>
+        </w:tc>
+        <w:tc>
+          <w:tcPr>
+            <w:tcW w:type="dxa" w:w="4320"/>
+          </w:tcPr>
+          <w:p>
+            <w:r>
+              <w:t>0.1670</w:t>
+            </w:r>
+          </w:p>
+        </w:tc>
+      </w:tr>
+      <w:tr>
+        <w:tc>
+          <w:tcPr>
+            <w:tcW w:type="dxa" w:w="4320"/>
+          </w:tcPr>
+          <w:p>
+            <w:r>
+              <w:t>p-value</w:t>
+            </w:r>
+          </w:p>
+        </w:tc>
+        <w:tc>
+          <w:tcPr>
+            <w:tcW w:type="dxa" w:w="4320"/>
+          </w:tcPr>
+          <w:p>
+            <w:r>
+              <w:t>1.3747e-12</w:t>
+            </w:r>
+          </w:p>
+        </w:tc>
+      </w:tr>
+    </w:tbl>
+    <w:p>
+      <w:pPr>
+        <w:pStyle w:val="Heading3"/>
+      </w:pPr>
+      <w:r>
+        <w:t>Plastic w=0.1, eta=0.025, mod=0.1 vs Plastic w=0.1, eta=0.025, mod=0.05</w:t>
+      </w:r>
+    </w:p>
+    <w:tbl>
+      <w:tblPr>
+        <w:tblStyle w:val="LightGrid-Accent1"/>
+        <w:tblW w:type="auto" w:w="0"/>
+        <w:tblLook w:firstColumn="1" w:firstRow="1" w:lastColumn="0" w:lastRow="0" w:noHBand="0" w:noVBand="1" w:val="04A0"/>
+      </w:tblPr>
+      <w:tblGrid>
+        <w:gridCol w:w="4320"/>
+        <w:gridCol w:w="4320"/>
+      </w:tblGrid>
+      <w:tr>
+        <w:tc>
+          <w:tcPr>
+            <w:tcW w:type="dxa" w:w="4320"/>
+          </w:tcPr>
+          <w:p>
+            <w:r>
+              <w:t>Metric</w:t>
+            </w:r>
+          </w:p>
+        </w:tc>
+        <w:tc>
+          <w:tcPr>
+            <w:tcW w:type="dxa" w:w="4320"/>
+          </w:tcPr>
+          <w:p>
+            <w:r>
+              <w:t>Value</w:t>
+            </w:r>
+          </w:p>
+        </w:tc>
+      </w:tr>
+      <w:tr>
+        <w:tc>
+          <w:tcPr>
+            <w:tcW w:type="dxa" w:w="4320"/>
+          </w:tcPr>
+          <w:p>
+            <w:r>
+              <w:t>KS statistic</w:t>
+            </w:r>
+          </w:p>
+        </w:tc>
+        <w:tc>
+          <w:tcPr>
+            <w:tcW w:type="dxa" w:w="4320"/>
+          </w:tcPr>
+          <w:p>
+            <w:r>
+              <w:t>0.0690</w:t>
+            </w:r>
+          </w:p>
+        </w:tc>
+      </w:tr>
+      <w:tr>
+        <w:tc>
+          <w:tcPr>
+            <w:tcW w:type="dxa" w:w="4320"/>
+          </w:tcPr>
+          <w:p>
+            <w:r>
+              <w:t>p-value</w:t>
+            </w:r>
+          </w:p>
+        </w:tc>
+        <w:tc>
+          <w:tcPr>
+            <w:tcW w:type="dxa" w:w="4320"/>
+          </w:tcPr>
+          <w:p>
+            <w:r>
+              <w:t>1.7090e-02</w:t>
+            </w:r>
+          </w:p>
+        </w:tc>
+      </w:tr>
+    </w:tbl>
+    <w:p>
+      <w:pPr>
+        <w:pStyle w:val="Heading3"/>
+      </w:pPr>
+      <w:r>
+        <w:t>Plastic w=0.1, eta=0.025, mod=0.1 vs Plastic w=0.1, eta=0.01, mod=0.1</w:t>
+      </w:r>
+    </w:p>
+    <w:tbl>
+      <w:tblPr>
+        <w:tblStyle w:val="LightGrid-Accent1"/>
+        <w:tblW w:type="auto" w:w="0"/>
+        <w:tblLook w:firstColumn="1" w:firstRow="1" w:lastColumn="0" w:lastRow="0" w:noHBand="0" w:noVBand="1" w:val="04A0"/>
+      </w:tblPr>
+      <w:tblGrid>
+        <w:gridCol w:w="4320"/>
+        <w:gridCol w:w="4320"/>
+      </w:tblGrid>
+      <w:tr>
+        <w:tc>
+          <w:tcPr>
+            <w:tcW w:type="dxa" w:w="4320"/>
+          </w:tcPr>
+          <w:p>
+            <w:r>
+              <w:t>Metric</w:t>
+            </w:r>
+          </w:p>
+        </w:tc>
+        <w:tc>
+          <w:tcPr>
+            <w:tcW w:type="dxa" w:w="4320"/>
+          </w:tcPr>
+          <w:p>
+            <w:r>
+              <w:t>Value</w:t>
+            </w:r>
+          </w:p>
+        </w:tc>
+      </w:tr>
+      <w:tr>
+        <w:tc>
+          <w:tcPr>
+            <w:tcW w:type="dxa" w:w="4320"/>
+          </w:tcPr>
+          <w:p>
+            <w:r>
+              <w:t>KS statistic</w:t>
+            </w:r>
+          </w:p>
+        </w:tc>
+        <w:tc>
+          <w:tcPr>
+            <w:tcW w:type="dxa" w:w="4320"/>
+          </w:tcPr>
+          <w:p>
+            <w:r>
+              <w:t>0.0900</w:t>
+            </w:r>
+          </w:p>
+        </w:tc>
+      </w:tr>
+      <w:tr>
+        <w:tc>
+          <w:tcPr>
+            <w:tcW w:type="dxa" w:w="4320"/>
+          </w:tcPr>
+          <w:p>
+            <w:r>
+              <w:t>p-value</w:t>
+            </w:r>
+          </w:p>
+        </w:tc>
+        <w:tc>
+          <w:tcPr>
+            <w:tcW w:type="dxa" w:w="4320"/>
+          </w:tcPr>
+          <w:p>
+            <w:r>
+              <w:t>6.0290e-04</w:t>
+            </w:r>
+          </w:p>
+        </w:tc>
+      </w:tr>
+    </w:tbl>
+    <w:p>
+      <w:pPr>
+        <w:pStyle w:val="Heading3"/>
+      </w:pPr>
+      <w:r>
+        <w:t>Plastic w=0.1, eta=0.025, mod=0.1 vs Plastic w=0.1, eta=0.01, mod=0.05</w:t>
+      </w:r>
+    </w:p>
+    <w:tbl>
+      <w:tblPr>
+        <w:tblStyle w:val="LightGrid-Accent1"/>
+        <w:tblW w:type="auto" w:w="0"/>
+        <w:tblLook w:firstColumn="1" w:firstRow="1" w:lastColumn="0" w:lastRow="0" w:noHBand="0" w:noVBand="1" w:val="04A0"/>
+      </w:tblPr>
+      <w:tblGrid>
+        <w:gridCol w:w="4320"/>
+        <w:gridCol w:w="4320"/>
+      </w:tblGrid>
+      <w:tr>
+        <w:tc>
+          <w:tcPr>
+            <w:tcW w:type="dxa" w:w="4320"/>
+          </w:tcPr>
+          <w:p>
+            <w:r>
+              <w:t>Metric</w:t>
+            </w:r>
+          </w:p>
+        </w:tc>
+        <w:tc>
+          <w:tcPr>
+            <w:tcW w:type="dxa" w:w="4320"/>
+          </w:tcPr>
+          <w:p>
+            <w:r>
+              <w:t>Value</w:t>
+            </w:r>
+          </w:p>
+        </w:tc>
+      </w:tr>
+      <w:tr>
+        <w:tc>
+          <w:tcPr>
+            <w:tcW w:type="dxa" w:w="4320"/>
+          </w:tcPr>
+          <w:p>
+            <w:r>
+              <w:t>KS statistic</w:t>
+            </w:r>
+          </w:p>
+        </w:tc>
+        <w:tc>
+          <w:tcPr>
+            <w:tcW w:type="dxa" w:w="4320"/>
+          </w:tcPr>
+          <w:p>
+            <w:r>
+              <w:t>0.1190</w:t>
+            </w:r>
+          </w:p>
+        </w:tc>
+      </w:tr>
+      <w:tr>
+        <w:tc>
+          <w:tcPr>
+            <w:tcW w:type="dxa" w:w="4320"/>
+          </w:tcPr>
+          <w:p>
+            <w:r>
+              <w:t>p-value</w:t>
+            </w:r>
+          </w:p>
+        </w:tc>
+        <w:tc>
+          <w:tcPr>
+            <w:tcW w:type="dxa" w:w="4320"/>
+          </w:tcPr>
+          <w:p>
+            <w:r>
+              <w:t>1.3787e-06</w:t>
+            </w:r>
+          </w:p>
+        </w:tc>
+      </w:tr>
+    </w:tbl>
+    <w:p>
+      <w:pPr>
+        <w:pStyle w:val="Heading3"/>
+      </w:pPr>
+      <w:r>
+        <w:t>Plastic w=0.1, eta=0.025, mod=0.05 vs Plastic w=0.1, eta=0.01, mod=0.1</w:t>
+      </w:r>
+    </w:p>
+    <w:tbl>
+      <w:tblPr>
+        <w:tblStyle w:val="LightGrid-Accent1"/>
+        <w:tblW w:type="auto" w:w="0"/>
+        <w:tblLook w:firstColumn="1" w:firstRow="1" w:lastColumn="0" w:lastRow="0" w:noHBand="0" w:noVBand="1" w:val="04A0"/>
+      </w:tblPr>
+      <w:tblGrid>
+        <w:gridCol w:w="4320"/>
+        <w:gridCol w:w="4320"/>
+      </w:tblGrid>
+      <w:tr>
+        <w:tc>
+          <w:tcPr>
+            <w:tcW w:type="dxa" w:w="4320"/>
+          </w:tcPr>
+          <w:p>
+            <w:r>
+              <w:t>Metric</w:t>
+            </w:r>
+          </w:p>
+        </w:tc>
+        <w:tc>
+          <w:tcPr>
+            <w:tcW w:type="dxa" w:w="4320"/>
+          </w:tcPr>
+          <w:p>
+            <w:r>
+              <w:t>Value</w:t>
+            </w:r>
+          </w:p>
+        </w:tc>
+      </w:tr>
+      <w:tr>
+        <w:tc>
+          <w:tcPr>
+            <w:tcW w:type="dxa" w:w="4320"/>
+          </w:tcPr>
+          <w:p>
+            <w:r>
+              <w:t>KS statistic</w:t>
+            </w:r>
+          </w:p>
+        </w:tc>
+        <w:tc>
+          <w:tcPr>
+            <w:tcW w:type="dxa" w:w="4320"/>
+          </w:tcPr>
+          <w:p>
+            <w:r>
+              <w:t>0.0540</w:t>
+            </w:r>
+          </w:p>
+        </w:tc>
+      </w:tr>
+      <w:tr>
+        <w:tc>
+          <w:tcPr>
+            <w:tcW w:type="dxa" w:w="4320"/>
+          </w:tcPr>
+          <w:p>
+            <w:r>
+              <w:t>p-value</w:t>
+            </w:r>
+          </w:p>
+        </w:tc>
+        <w:tc>
+          <w:tcPr>
+            <w:tcW w:type="dxa" w:w="4320"/>
+          </w:tcPr>
+          <w:p>
+            <w:r>
+              <w:t>1.0829e-01</w:t>
+            </w:r>
+          </w:p>
+        </w:tc>
+      </w:tr>
+    </w:tbl>
+    <w:p>
+      <w:pPr>
+        <w:pStyle w:val="Heading3"/>
+      </w:pPr>
+      <w:r>
+        <w:t>Plastic w=0.1, eta=0.025, mod=0.05 vs Plastic w=0.1, eta=0.01, mod=0.05</w:t>
+      </w:r>
+    </w:p>
+    <w:tbl>
+      <w:tblPr>
+        <w:tblStyle w:val="LightGrid-Accent1"/>
+        <w:tblW w:type="auto" w:w="0"/>
+        <w:tblLook w:firstColumn="1" w:firstRow="1" w:lastColumn="0" w:lastRow="0" w:noHBand="0" w:noVBand="1" w:val="04A0"/>
+      </w:tblPr>
+      <w:tblGrid>
+        <w:gridCol w:w="4320"/>
+        <w:gridCol w:w="4320"/>
+      </w:tblGrid>
+      <w:tr>
+        <w:tc>
+          <w:tcPr>
+            <w:tcW w:type="dxa" w:w="4320"/>
+          </w:tcPr>
+          <w:p>
+            <w:r>
+              <w:t>Metric</w:t>
+            </w:r>
+          </w:p>
+        </w:tc>
+        <w:tc>
+          <w:tcPr>
+            <w:tcW w:type="dxa" w:w="4320"/>
+          </w:tcPr>
+          <w:p>
+            <w:r>
+              <w:t>Value</w:t>
+            </w:r>
+          </w:p>
+        </w:tc>
+      </w:tr>
+      <w:tr>
+        <w:tc>
+          <w:tcPr>
+            <w:tcW w:type="dxa" w:w="4320"/>
+          </w:tcPr>
+          <w:p>
+            <w:r>
+              <w:t>KS statistic</w:t>
+            </w:r>
+          </w:p>
+        </w:tc>
+        <w:tc>
+          <w:tcPr>
+            <w:tcW w:type="dxa" w:w="4320"/>
+          </w:tcPr>
+          <w:p>
+            <w:r>
+              <w:t>0.0780</w:t>
+            </w:r>
+          </w:p>
+        </w:tc>
+      </w:tr>
+      <w:tr>
+        <w:tc>
+          <w:tcPr>
+            <w:tcW w:type="dxa" w:w="4320"/>
+          </w:tcPr>
+          <w:p>
+            <w:r>
+              <w:t>p-value</w:t>
+            </w:r>
+          </w:p>
+        </w:tc>
+        <w:tc>
+          <w:tcPr>
+            <w:tcW w:type="dxa" w:w="4320"/>
+          </w:tcPr>
+          <w:p>
+            <w:r>
+              <w:t>4.5438e-03</w:t>
+            </w:r>
+          </w:p>
+        </w:tc>
+      </w:tr>
+    </w:tbl>
+    <w:p>
+      <w:pPr>
+        <w:pStyle w:val="Heading3"/>
+      </w:pPr>
+      <w:r>
+        <w:t>Plastic w=0.1, eta=0.01, mod=0.1 vs Plastic w=0.1, eta=0.01, mod=0.05</w:t>
+      </w:r>
+    </w:p>
+    <w:tbl>
+      <w:tblPr>
+        <w:tblStyle w:val="LightGrid-Accent1"/>
+        <w:tblW w:type="auto" w:w="0"/>
+        <w:tblLook w:firstColumn="1" w:firstRow="1" w:lastColumn="0" w:lastRow="0" w:noHBand="0" w:noVBand="1" w:val="04A0"/>
+      </w:tblPr>
+      <w:tblGrid>
+        <w:gridCol w:w="4320"/>
+        <w:gridCol w:w="4320"/>
+      </w:tblGrid>
+      <w:tr>
+        <w:tc>
+          <w:tcPr>
+            <w:tcW w:type="dxa" w:w="4320"/>
+          </w:tcPr>
+          <w:p>
+            <w:r>
+              <w:t>Metric</w:t>
+            </w:r>
+          </w:p>
+        </w:tc>
+        <w:tc>
+          <w:tcPr>
+            <w:tcW w:type="dxa" w:w="4320"/>
+          </w:tcPr>
+          <w:p>
+            <w:r>
+              <w:t>Value</w:t>
+            </w:r>
+          </w:p>
+        </w:tc>
+      </w:tr>
+      <w:tr>
+        <w:tc>
+          <w:tcPr>
+            <w:tcW w:type="dxa" w:w="4320"/>
+          </w:tcPr>
+          <w:p>
+            <w:r>
+              <w:t>KS statistic</w:t>
+            </w:r>
+          </w:p>
+        </w:tc>
+        <w:tc>
+          <w:tcPr>
+            <w:tcW w:type="dxa" w:w="4320"/>
+          </w:tcPr>
+          <w:p>
+            <w:r>
+              <w:t>0.0440</w:t>
+            </w:r>
+          </w:p>
+        </w:tc>
+      </w:tr>
+      <w:tr>
+        <w:tc>
+          <w:tcPr>
+            <w:tcW w:type="dxa" w:w="4320"/>
+          </w:tcPr>
+          <w:p>
+            <w:r>
+              <w:t>p-value</w:t>
+            </w:r>
+          </w:p>
+        </w:tc>
+        <w:tc>
+          <w:tcPr>
+            <w:tcW w:type="dxa" w:w="4320"/>
+          </w:tcPr>
+          <w:p>
+            <w:r>
+              <w:t>2.8780e-01</w:t>
             </w:r>
           </w:p>
         </w:tc>

</xml_diff>